<commit_message>
fix(kredit/ipoteka): çıxarış no olmayanda "seriyalı" sözü düşməsin
Yeni çıxarışlarda seriya/no olmaya bilər. Əvvəl şablonda "{i_cixarisNo} seriyalı,"
sabit idi → no boş olanda "verilmiş  seriyalı, tarixli" kimi ilişirdi. İki İpoteka
şablonundan (ferqli + Tek) sabit " seriyalı, " mətni silindi; controller
{i_cixarisNo}-nu şərti verir: no varsa "{no} seriyalı, ", yoxdursa boş.
Nəticə no yoxdursa: "...tərəfindən verilmiş {tarix} tarixli çıxarışa əsasən...".

Co-Authored-By: Claude Opus 4.8 <noreply@anthropic.com>
Claude-Session: https://claude.ai/code/session_01H9rdztrqGAu2ptsyRx5tbS
</commit_message>
<xml_diff>
--- a/FinNex.UI/wwwroot/Files/Word/Kredit/Dasinmaz_emlak_ipoteka_muqavilesi.docx
+++ b/FinNex.UI/wwwroot/Files/Word/Kredit/Dasinmaz_emlak_ipoteka_muqavilesi.docx
@@ -2045,7 +2045,7 @@
           <w:szCs w:val="24"/>
           <w:lang w:val="az-Latn-AZ"/>
         </w:rPr>
-        <w:t xml:space="preserve"> seriyal</w:t>
+        <w:t xml:space="preserve"/>
       </w:r>
       <w:r>
         <w:rPr>
@@ -2054,16 +2054,16 @@
           <w:szCs w:val="24"/>
           <w:lang w:val="az-Latn-AZ"/>
         </w:rPr>
-        <w:t>ı</w:t>
-      </w:r>
-      <w:r>
-        <w:rPr>
-          <w:rFonts w:ascii="Times New Roman" w:hAnsi="Times New Roman"/>
-          <w:sz w:val="24"/>
-          <w:szCs w:val="24"/>
-          <w:lang w:val="az-Latn-AZ"/>
-        </w:rPr>
-        <w:t xml:space="preserve">, </w:t>
+        <w:t/>
+      </w:r>
+      <w:r>
+        <w:rPr>
+          <w:rFonts w:ascii="Times New Roman" w:hAnsi="Times New Roman"/>
+          <w:sz w:val="24"/>
+          <w:szCs w:val="24"/>
+          <w:lang w:val="az-Latn-AZ"/>
+        </w:rPr>
+        <w:t xml:space="preserve"/>
       </w:r>
       <w:r>
         <w:rPr>

</xml_diff>